<commit_message>
docs: update LOI_CAM_ON_MOI.docx with natural, standard student prose
</commit_message>
<xml_diff>
--- a/03_Tai_Lieu_Do_An/06_Bao_Cao_Ket_Qua_Do_An/LOI_CAM_ON_MOI.docx
+++ b/03_Tai_Lieu_Do_An/06_Bao_Cao_Ket_Qua_Do_An/LOI_CAM_ON_MOI.docx
@@ -30,7 +30,7 @@
           <w:color w:val="000000"/>
           <w:sz w:val="26"/>
         </w:rPr>
-        <w:t>Sau thời gian học tập, nghiên cứu và nỗ lực triển khai thực tế, đồ án học phần Dữ liệu NoSQL với đề tài "Nền tảng E-Learning &amp; Khảo sát năng lực tiếng Anh thực chiến tích hợp đa mô hình NoSQL (EduPro Academy)" đã được nhóm sinh viên hoàn thiện. Để đạt được kết quả này, bên cạnh sự nỗ lực cố gắng của các thành viên trong nhóm, chúng em đã may mắn nhận được sự quan tâm giúp đỡ quý báu, sự tận tâm giảng dạy từ Quý Thầy Cô, cùng sự ủng hộ to lớn từ Gia đình và Bạn bè.</w:t>
+        <w:t>Để hoàn thành đồ án học phần Dữ liệu NoSQL với đề tài "Nền tảng E-Learning &amp; Khảo sát năng lực tiếng Anh thực chiến tích hợp đa mô hình NoSQL (EduPro Academy)", nhóm chúng em xin gửi lời cảm ơn chân thành đến Ban Giám hiệu Trường Đại học Công Thương TP. Hồ Chí Minh (HUIT) và Ban Chủ nhiệm Khoa Công nghệ Thông tin đã tạo điều kiện học tập thuận lợi và hỗ trợ cơ sở vật chất cho chúng em trong suốt thời gian học tập tại trường.</w:t>
       </w:r>
     </w:p>
     <w:p>
@@ -45,7 +45,7 @@
           <w:color w:val="000000"/>
           <w:sz w:val="26"/>
         </w:rPr>
-        <w:t>Trước hết, nhóm chúng em xin gửi lời cảm ơn chân thành, sâu sắc và lòng kính trọng nhất tới TS. Nguyễn Thị Định – giảng viên trực tiếp giảng dạy và tận tâm hướng dẫn học phần Dữ liệu NoSQL (Mã HP: 01201073). Trong suốt quá trình thực hiện đồ án, Cô đã luôn dành nhiều thời gian quý báu để định hướng phương pháp tiếp cận đề tài, truyền đạt những nền tảng tri thức chuyên sâu về cơ sở dữ liệu phi quan hệ và các kiến trúc phân tán hiện đại. Những lời góp ý khoa học, thực tiễn và sự chỉ dẫn ân cần của Cô chính là kim chỉ nam giúp nhóm vượt qua các rào cản kỹ thuật phức tạp, hoàn thiện sản phẩm đúng tiến độ và nâng cao chất lượng học thuật của toàn bộ công trình.</w:t>
+        <w:t>Đặc biệt, nhóm chúng em xin bày tỏ lòng biết ơn sâu sắc đến TS. Nguyễn Thị Định – giảng viên trực tiếp hướng dẫn học phần. Trong suốt thời gian thực hiện đồ án, cô đã luôn nhiệt tình hướng dẫn, giải đáp thắc mắc và đóng góp những ý kiến chuyên môn quý báu giúp chúng em định hướng đề tài, giải quyết các khó khăn kỹ thuật và hoàn thành đồ án đúng thời hạn.</w:t>
       </w:r>
     </w:p>
     <w:p>
@@ -60,7 +60,7 @@
           <w:color w:val="000000"/>
           <w:sz w:val="26"/>
         </w:rPr>
-        <w:t>Nhóm tác giả cũng xin trân trọng gửi lời cảm ơn đến Ban Giám hiệu Trường Đại học Công Thương TP. Hồ Chí Minh (HUIT), Ban Chủ nhiệm Khoa Công nghệ Thông tin cùng toàn thể Quý Thầy, Cô giáo thuộc Bộ môn Cơ sở Dữ liệu. Quý Thầy, Cô đã luôn tâm huyết truyền dạy cho chúng em hành trang kiến thức công nghệ thông tin vững chắc, xây dựng môi trường học thuật chuyên nghiệp và trang bị hệ thống phòng thực hành máy tính hiện đại, tạo nền tảng tối ưu cho việc nghiên cứu và thực nghiệm đề tài.</w:t>
+        <w:t>Chúng em cũng xin gửi lời cảm ơn đến quý Thầy Cô trong Bộ môn Cơ sở Dữ liệu cũng như các Thầy Cô trong Khoa Công nghệ Thông tin đã truyền đạt những kiến thức nền tảng và chuyên ngành bổ ích cho chúng em trong suốt các năm học vừa qua.</w:t>
       </w:r>
     </w:p>
     <w:p>
@@ -75,7 +75,7 @@
           <w:color w:val="000000"/>
           <w:sz w:val="26"/>
         </w:rPr>
-        <w:t>Chúng con xin bày tỏ lòng biết ơn vô hạn đến Cha Mẹ và Gia đình – điểm tựa tinh thần vững chắc nhất, đã luôn thương yêu, thấu hiểu, động viên và tạo mọi điều kiện tốt nhất để chúng con an tâm học tập, nghiên cứu và theo đuổi đam mê. Đồng thời, nhóm cũng xin gửi lời cảm ơn chân thành tới các bạn sinh viên tập thể lớp 14DHTH đã luôn đồng hành, chia sẻ kinh nghiệm học tập và tích cực hỗ trợ nhóm trong các đợt kiểm thử thực tế hệ thống phần mềm.</w:t>
+        <w:t>Đồng thời, nhóm xin cảm ơn gia đình đã luôn động viên, hỗ trợ về mọi mặt; cảm ơn các bạn sinh viên tập thể lớp 14DHTH đã luôn chia sẻ kinh nghiệm, giúp đỡ lẫn nhau trong quá trình học tập và làm đồ án.</w:t>
       </w:r>
     </w:p>
     <w:p>
@@ -90,12 +90,28 @@
           <w:color w:val="000000"/>
           <w:sz w:val="26"/>
         </w:rPr>
-        <w:t>Mặc dù các thành viên trong nhóm đã dành trọn tâm huyết và làm việc với tinh thần nghiêm túc cao nhất, song do giới hạn về mặt thời gian và kinh nghiệm thực tiễn, đồ án chắc chắn khó tránh khỏi những thiếu sót nhất định. Nhóm sinh viên thực hiện rất mong nhận được những lời chỉ bảo, đánh giá chân thành và những ý kiến đóng góp quý báu từ Quý Thầy, Cô trong Hội đồng chấm điểm để đề tài tiếp tục được hoàn thiện và phát triển hơn nữa trong tương lai.</w:t>
+        <w:t>Mặc dù đã cố gắng hết sức để hoàn thành đề tài một cách tốt nhất, nhưng do kiến thức và kinh nghiệm thực tế của chúng em còn hạn chế nên đồ án chắc chắn không tránh khỏi những thiếu sót. Nhóm chúng em rất mong nhận được những nhận xét, đóng góp ý kiến của quý Thầy Cô để đồ án được hoàn thiện hơn.</w:t>
       </w:r>
     </w:p>
     <w:p>
       <w:pPr>
-        <w:spacing w:before="360" w:after="40" w:line="312" w:lineRule="auto"/>
+        <w:spacing w:before="160" w:after="80"/>
+        <w:ind w:firstLine="567"/>
+        <w:jc w:val="left"/>
+      </w:pPr>
+      <w:r>
+        <w:rPr>
+          <w:rFonts w:ascii="Times New Roman" w:hAnsi="Times New Roman"/>
+          <w:i/>
+          <w:color w:val="000000"/>
+          <w:sz w:val="26"/>
+        </w:rPr>
+        <w:t>Chúng em xin chân thành cảm ơn!</w:t>
+      </w:r>
+    </w:p>
+    <w:p>
+      <w:pPr>
+        <w:spacing w:before="320" w:after="40" w:line="312" w:lineRule="auto"/>
         <w:ind w:firstLine="0"/>
         <w:jc w:val="right"/>
       </w:pPr>

</xml_diff>